<commit_message>
SRS: insert Use Case Diagram into section 5.1
Co-Authored-By: Claude Opus 5.5 <noreply@anthropic.com>
</commit_message>
<xml_diff>
--- a/docs/srs/02_요구사항명세서(SRS)_전동기_v0.4.docx
+++ b/docs/srs/02_요구사항명세서(SRS)_전동기_v0.4.docx
@@ -25356,7 +25356,38 @@
           <w:sz w:val="20"/>
           <w:szCs w:val="20"/>
         </w:rPr>
-        <w:t xml:space="preserve">[Use Case Diagram 삽입 위치 — 위 관계를 UML 도구로 작성해 삽입]</w:t>
+        <w:drawing>
+          <wp:inline xmlns:a="http://schemas.openxmlformats.org/drawingml/2006/main" xmlns:pic="http://schemas.openxmlformats.org/drawingml/2006/picture">
+            <wp:extent cx="4320000" cy="6768970"/>
+            <wp:docPr id="1" name="Picture 1"/>
+            <wp:cNvGraphicFramePr>
+              <a:graphicFrameLocks noChangeAspect="1"/>
+            </wp:cNvGraphicFramePr>
+            <a:graphic>
+              <a:graphicData uri="http://schemas.openxmlformats.org/drawingml/2006/picture">
+                <pic:pic>
+                  <pic:nvPicPr>
+                    <pic:cNvPr id="0" name="usecase_전동기.png"/>
+                    <pic:cNvPicPr/>
+                  </pic:nvPicPr>
+                  <pic:blipFill>
+                    <a:blip r:embed="rId11"/>
+                    <a:stretch>
+                      <a:fillRect/>
+                    </a:stretch>
+                  </pic:blipFill>
+                  <pic:spPr>
+                    <a:xfrm>
+                      <a:off x="0" y="0"/>
+                      <a:ext cx="4320000" cy="6768970"/>
+                    </a:xfrm>
+                    <a:prstGeom prst="rect"/>
+                  </pic:spPr>
+                </pic:pic>
+              </a:graphicData>
+            </a:graphic>
+          </wp:inline>
+        </w:drawing>
       </w:r>
     </w:p>
     <w:p>

</xml_diff>